<commit_message>
05.2: store Loss Limit tool_id as text; 05.3 and 05.4: align with manuscript, correct cooldown values and convergent figures
</commit_message>
<xml_diff>
--- a/materials/05_implementation_architectures/asb_framework_05_3_architecture_codebook.docx
+++ b/materials/05_implementation_architectures/asb_framework_05_3_architecture_codebook.docx
@@ -2145,7 +2145,7 @@
                 <w:sz w:val="20"/>
                 <w:szCs w:val="20"/>
               </w:rPr>
-              <w:t>Variants marked fully_specified have a complete operational specification: design parameters set, message copy developed (where applicable), policy rules in place. Variants marked specified_not_built have a complete operational specification but were not built within the project timeline (e.g., Cheat Sheet variants in both architectures). UK distribution: 69 fully_specified (73.4%), 25 specified_not_built (26.6%). NL distribution: 72 fully_specified (82.8%), 15 specified_not_built (17.2%).</w:t>
+              <w:t>Variants marked fully_specified (reported in the main manuscript as operationally complete) have a complete operational specification: design parameters set, message copy developed (where applicable), policy rules in place. Variants marked specified_not_built (specified but not built) have a complete operational specification but were not built within the project timeline (e.g., Cheat Sheet variants in both architectures). UK distribution: 69 fully_specified (73.4%), 25 specified_not_built (26.6%). NL distribution: 72 fully_specified (82.8%), 15 specified_not_built (17.2%).</w:t>
             </w:r>
           </w:p>
         </w:tc>
@@ -3248,7 +3248,7 @@
                 <w:sz w:val="20"/>
                 <w:szCs w:val="20"/>
               </w:rPr>
-              <w:t>Across both architectures, decrease is uniformly True with immediate effect: players can always reduce limits without delay. increase is variable: typically True at R1 and R2 with a tier-specific cooldown, and False or strictly delayed at R3 (high risk). UK uses 6 distinct cooldown values (24h, 48h, 168h, plus disable_24h, disable_24h_daily_168h_weekly, and ‘none’); NL uniformly applies 168h across all tiers, reflecting the KOA 2021 mandate. This asymmetric structure (decreases easy, increases gated) operationalises the framework’s Reversibility dimension; the tier-specific tightening operationalises the framework’s adaptive design principle.</w:t>
+              <w:t>Across both architectures, decrease is uniformly True with immediate effect: players can always reduce limits without delay. increase is variable: typically True at R1 and R2 with a tier-specific cooldown, and False or strictly delayed at R3 (high risk). UK uses 6 distinct cooldown values (24h, 48h, none, disable_24h, disable_24h_daily_168h_weekly, and cannot-disable at R3); NL uniformly applies 168h across all tiers, reflecting the KOA 2021 mandate. This asymmetric structure (decreases easy, increases gated) operationalises the framework’s Reversibility dimension; the tier-specific tightening operationalises the framework’s adaptive design principle.</w:t>
             </w:r>
           </w:p>
         </w:tc>
@@ -8323,7 +8323,7 @@
                 <w:sz w:val="20"/>
                 <w:szCs w:val="20"/>
               </w:rPr>
-              <w:t>UK uses 6 distinct values (24h, 48h, 168h, plus disable_24h, disable_24h_daily_168h_weekly, none); NL uniformly applies 168h across all tiers.</w:t>
+              <w:t>UK uses 6 distinct values (24h, 48h, none, disable_24h, disable_24h_daily_168h_weekly, and cannot-disable at R3); NL uniformly applies 168h across all tiers.</w:t>
             </w:r>
           </w:p>
         </w:tc>

</xml_diff>